<commit_message>
Complète le document des entités et règles de gestion (titre, RG05 à RG24 pour tous les domaines)
</commit_message>
<xml_diff>
--- a/docs/MCD_Entites_et_Regles_de_gestion.docx
+++ b/docs/MCD_Entites_et_Regles_de_gestion.docx
@@ -4,6 +4,22 @@
   <w:body>
     <w:p>
       <w:pPr>
+        <w:pStyle w:val="Heading1"/>
+        <w:spacing w:after="220" w:before="0"/>
+      </w:pPr>
+      <w:r>
+        <w:rPr>
+          <w:b/>
+          <w:bCs/>
+          <w:color w:val="F79646"/>
+          <w:sz w:val="30"/>
+          <w:szCs w:val="30"/>
+        </w:rPr>
+        <w:t xml:space="preserve">II. ÉLABORATION DES MODÈLES CONCEPTUELS</w:t>
+      </w:r>
+    </w:p>
+    <w:p>
+      <w:pPr>
         <w:spacing w:after="160" w:line="300"/>
         <w:jc w:val="both"/>
       </w:pPr>
@@ -17,7 +33,7 @@
         <w:jc w:val="both"/>
       </w:pPr>
       <w:r>
-        <w:t xml:space="preserve">Voici la liste directe des entités de nos 12 entités de notre plateforme classées par domaine :</w:t>
+        <w:t xml:space="preserve">Voici la liste directe des entités des 12 entités de notre plateforme classées par domaine :</w:t>
       </w:r>
     </w:p>
     <w:p>
@@ -434,6 +450,506 @@
       </w:r>
       <w:r>
         <w:t xml:space="preserve">Un agent occupe une et une seule fonction à un instant donné et est affecté à une et une seule structure administrative.</w:t>
+      </w:r>
+    </w:p>
+    <w:p>
+      <w:pPr>
+        <w:pStyle w:val="Heading3"/>
+        <w:spacing w:after="100" w:before="200"/>
+      </w:pPr>
+      <w:r>
+        <w:rPr>
+          <w:b/>
+          <w:bCs/>
+          <w:color w:val="F79646"/>
+          <w:sz w:val="22"/>
+          <w:szCs w:val="22"/>
+        </w:rPr>
+        <w:t xml:space="preserve">1.2 Gestion des agents et sécurité (RBAC)</w:t>
+      </w:r>
+    </w:p>
+    <w:p>
+      <w:pPr>
+        <w:pStyle w:val="ListParagraph"/>
+        <w:numPr>
+          <w:ilvl w:val="0"/>
+          <w:numId w:val="2"/>
+        </w:numPr>
+        <w:spacing w:after="100" w:line="290"/>
+        <w:jc w:val="both"/>
+      </w:pPr>
+      <w:r>
+        <w:rPr>
+          <w:b/>
+          <w:bCs/>
+        </w:rPr>
+        <w:t xml:space="preserve">RG05 : </w:t>
+      </w:r>
+      <w:r>
+        <w:t xml:space="preserve">Un agent possède au plus un compte utilisateur, qui lui permet de se connecter à la plateforme avec son matricule.</w:t>
+      </w:r>
+    </w:p>
+    <w:p>
+      <w:pPr>
+        <w:pStyle w:val="ListParagraph"/>
+        <w:numPr>
+          <w:ilvl w:val="0"/>
+          <w:numId w:val="2"/>
+        </w:numPr>
+        <w:spacing w:after="100" w:line="290"/>
+        <w:jc w:val="both"/>
+      </w:pPr>
+      <w:r>
+        <w:rPr>
+          <w:b/>
+          <w:bCs/>
+        </w:rPr>
+        <w:t xml:space="preserve">RG06 : </w:t>
+      </w:r>
+      <w:r>
+        <w:t xml:space="preserve">Un compte utilisateur est rattaché à un et un seul agent.</w:t>
+      </w:r>
+    </w:p>
+    <w:p>
+      <w:pPr>
+        <w:pStyle w:val="ListParagraph"/>
+        <w:numPr>
+          <w:ilvl w:val="0"/>
+          <w:numId w:val="2"/>
+        </w:numPr>
+        <w:spacing w:after="100" w:line="290"/>
+        <w:jc w:val="both"/>
+      </w:pPr>
+      <w:r>
+        <w:rPr>
+          <w:b/>
+          <w:bCs/>
+        </w:rPr>
+        <w:t xml:space="preserve">RG07 : </w:t>
+      </w:r>
+      <w:r>
+        <w:t xml:space="preserve">Un compte utilisateur se voit attribuer un ou plusieurs rôles, qui définissent l'espace et les actions auxquels il a accès.</w:t>
+      </w:r>
+    </w:p>
+    <w:p>
+      <w:pPr>
+        <w:pStyle w:val="ListParagraph"/>
+        <w:numPr>
+          <w:ilvl w:val="0"/>
+          <w:numId w:val="2"/>
+        </w:numPr>
+        <w:spacing w:after="100" w:line="290"/>
+        <w:jc w:val="both"/>
+      </w:pPr>
+      <w:r>
+        <w:rPr>
+          <w:b/>
+          <w:bCs/>
+        </w:rPr>
+        <w:t xml:space="preserve">RG08 : </w:t>
+      </w:r>
+      <w:r>
+        <w:t xml:space="preserve">Un rôle regroupe un ou plusieurs privilèges (droits élémentaires) ; un privilège peut être accordé par plusieurs rôles.</w:t>
+      </w:r>
+    </w:p>
+    <w:p>
+      <w:pPr>
+        <w:pStyle w:val="ListParagraph"/>
+        <w:numPr>
+          <w:ilvl w:val="0"/>
+          <w:numId w:val="2"/>
+        </w:numPr>
+        <w:spacing w:after="100" w:line="290"/>
+        <w:jc w:val="both"/>
+      </w:pPr>
+      <w:r>
+        <w:rPr>
+          <w:b/>
+          <w:bCs/>
+        </w:rPr>
+        <w:t xml:space="preserve">RG09 : </w:t>
+      </w:r>
+      <w:r>
+        <w:t xml:space="preserve">Un compte suspendu par l'administrateur est immédiatement déconnecté et ne peut plus se reconnecter tant qu'il n'est pas réactivé.</w:t>
+      </w:r>
+    </w:p>
+    <w:p>
+      <w:pPr>
+        <w:pStyle w:val="Heading3"/>
+        <w:spacing w:after="100" w:before="200"/>
+      </w:pPr>
+      <w:r>
+        <w:rPr>
+          <w:b/>
+          <w:bCs/>
+          <w:color w:val="F79646"/>
+          <w:sz w:val="22"/>
+          <w:szCs w:val="22"/>
+        </w:rPr>
+        <w:t xml:space="preserve">1.3 Demandes d'absence (Permissions)</w:t>
+      </w:r>
+    </w:p>
+    <w:p>
+      <w:pPr>
+        <w:pStyle w:val="ListParagraph"/>
+        <w:numPr>
+          <w:ilvl w:val="0"/>
+          <w:numId w:val="2"/>
+        </w:numPr>
+        <w:spacing w:after="100" w:line="290"/>
+        <w:jc w:val="both"/>
+      </w:pPr>
+      <w:r>
+        <w:rPr>
+          <w:b/>
+          <w:bCs/>
+        </w:rPr>
+        <w:t xml:space="preserve">RG10 : </w:t>
+      </w:r>
+      <w:r>
+        <w:t xml:space="preserve">Une demande de permission est déposée par un et un seul agent et concerne un et un seul type de permission.</w:t>
+      </w:r>
+    </w:p>
+    <w:p>
+      <w:pPr>
+        <w:pStyle w:val="ListParagraph"/>
+        <w:numPr>
+          <w:ilvl w:val="0"/>
+          <w:numId w:val="2"/>
+        </w:numPr>
+        <w:spacing w:after="100" w:line="290"/>
+        <w:jc w:val="both"/>
+      </w:pPr>
+      <w:r>
+        <w:rPr>
+          <w:b/>
+          <w:bCs/>
+        </w:rPr>
+        <w:t xml:space="preserve">RG11 : </w:t>
+      </w:r>
+      <w:r>
+        <w:t xml:space="preserve">La durée d'une demande de permission (nombre de jours entre la date de début et la date de fin) détermine son circuit : une demande de deux jours ou moins est soumise au visa du responsable hiérarchique de l'agent avant la décision finale ; une demande de plus de deux jours est transmise directement à la décision finale.</w:t>
+      </w:r>
+    </w:p>
+    <w:p>
+      <w:pPr>
+        <w:pStyle w:val="ListParagraph"/>
+        <w:numPr>
+          <w:ilvl w:val="0"/>
+          <w:numId w:val="2"/>
+        </w:numPr>
+        <w:spacing w:after="100" w:line="290"/>
+        <w:jc w:val="both"/>
+      </w:pPr>
+      <w:r>
+        <w:rPr>
+          <w:b/>
+          <w:bCs/>
+        </w:rPr>
+        <w:t xml:space="preserve">RG12 : </w:t>
+      </w:r>
+      <w:r>
+        <w:t xml:space="preserve">Une demande de permission est obligatoirement accompagnée d'une pièce justificative.</w:t>
+      </w:r>
+    </w:p>
+    <w:p>
+      <w:pPr>
+        <w:pStyle w:val="ListParagraph"/>
+        <w:numPr>
+          <w:ilvl w:val="0"/>
+          <w:numId w:val="2"/>
+        </w:numPr>
+        <w:spacing w:after="100" w:line="290"/>
+        <w:jc w:val="both"/>
+      </w:pPr>
+      <w:r>
+        <w:rPr>
+          <w:b/>
+          <w:bCs/>
+        </w:rPr>
+        <w:t xml:space="preserve">RG13 : </w:t>
+      </w:r>
+      <w:r>
+        <w:t xml:space="preserve">Le visa d'une demande de permission est réservé au responsable (Sous-Directeur ou Directeur) de la structure à laquelle appartient l'agent demandeur.</w:t>
+      </w:r>
+    </w:p>
+    <w:p>
+      <w:pPr>
+        <w:pStyle w:val="ListParagraph"/>
+        <w:numPr>
+          <w:ilvl w:val="0"/>
+          <w:numId w:val="2"/>
+        </w:numPr>
+        <w:spacing w:after="100" w:line="290"/>
+        <w:jc w:val="both"/>
+      </w:pPr>
+      <w:r>
+        <w:rPr>
+          <w:b/>
+          <w:bCs/>
+        </w:rPr>
+        <w:t xml:space="preserve">RG14 : </w:t>
+      </w:r>
+      <w:r>
+        <w:t xml:space="preserve">La décision finale sur une demande de permission — validation ou rejet motivé — est prise par le Directeur des Ressources Humaines (DRH).</w:t>
+      </w:r>
+    </w:p>
+    <w:p>
+      <w:pPr>
+        <w:pStyle w:val="ListParagraph"/>
+        <w:numPr>
+          <w:ilvl w:val="0"/>
+          <w:numId w:val="2"/>
+        </w:numPr>
+        <w:spacing w:after="100" w:line="290"/>
+        <w:jc w:val="both"/>
+      </w:pPr>
+      <w:r>
+        <w:rPr>
+          <w:b/>
+          <w:bCs/>
+        </w:rPr>
+        <w:t xml:space="preserve">RG15 : </w:t>
+      </w:r>
+      <w:r>
+        <w:t xml:space="preserve">Un dossier retourné pour correction ne peut être modifié que par l'agent qui l'a déposé, puis suit à nouveau le circuit de vérification.</w:t>
+      </w:r>
+    </w:p>
+    <w:p>
+      <w:pPr>
+        <w:pStyle w:val="Heading3"/>
+        <w:spacing w:after="100" w:before="200"/>
+      </w:pPr>
+      <w:r>
+        <w:rPr>
+          <w:b/>
+          <w:bCs/>
+          <w:color w:val="F79646"/>
+          <w:sz w:val="22"/>
+          <w:szCs w:val="22"/>
+        </w:rPr>
+        <w:t xml:space="preserve">1.4 État civil (Déclarations de naissance et de décès)</w:t>
+      </w:r>
+    </w:p>
+    <w:p>
+      <w:pPr>
+        <w:pStyle w:val="ListParagraph"/>
+        <w:numPr>
+          <w:ilvl w:val="0"/>
+          <w:numId w:val="2"/>
+        </w:numPr>
+        <w:spacing w:after="100" w:line="290"/>
+        <w:jc w:val="both"/>
+      </w:pPr>
+      <w:r>
+        <w:rPr>
+          <w:b/>
+          <w:bCs/>
+        </w:rPr>
+        <w:t xml:space="preserve">RG16 : </w:t>
+      </w:r>
+      <w:r>
+        <w:t xml:space="preserve">Une déclaration de naissance ou de décès est faite par un et un seul agent.</w:t>
+      </w:r>
+    </w:p>
+    <w:p>
+      <w:pPr>
+        <w:pStyle w:val="ListParagraph"/>
+        <w:numPr>
+          <w:ilvl w:val="0"/>
+          <w:numId w:val="2"/>
+        </w:numPr>
+        <w:spacing w:after="100" w:line="290"/>
+        <w:jc w:val="both"/>
+      </w:pPr>
+      <w:r>
+        <w:rPr>
+          <w:b/>
+          <w:bCs/>
+        </w:rPr>
+        <w:t xml:space="preserve">RG17 : </w:t>
+      </w:r>
+      <w:r>
+        <w:t xml:space="preserve">Une déclaration de naissance doit être obligatoirement justifiée par un extrait d'acte de naissance ; une déclaration de décès, par un certificat de décès.</w:t>
+      </w:r>
+    </w:p>
+    <w:p>
+      <w:pPr>
+        <w:pStyle w:val="ListParagraph"/>
+        <w:numPr>
+          <w:ilvl w:val="0"/>
+          <w:numId w:val="2"/>
+        </w:numPr>
+        <w:spacing w:after="100" w:line="290"/>
+        <w:jc w:val="both"/>
+      </w:pPr>
+      <w:r>
+        <w:rPr>
+          <w:b/>
+          <w:bCs/>
+        </w:rPr>
+        <w:t xml:space="preserve">RG18 : </w:t>
+      </w:r>
+      <w:r>
+        <w:t xml:space="preserve">Une déclaration de naissance ou de décès est validée ou rejetée, avec un motif obligatoire en cas de rejet, par le Directeur des Ressources Humaines (DRH).</w:t>
+      </w:r>
+    </w:p>
+    <w:p>
+      <w:pPr>
+        <w:pStyle w:val="ListParagraph"/>
+        <w:numPr>
+          <w:ilvl w:val="0"/>
+          <w:numId w:val="2"/>
+        </w:numPr>
+        <w:spacing w:after="100" w:line="290"/>
+        <w:jc w:val="both"/>
+      </w:pPr>
+      <w:r>
+        <w:rPr>
+          <w:b/>
+          <w:bCs/>
+        </w:rPr>
+        <w:t xml:space="preserve">RG19 : </w:t>
+      </w:r>
+      <w:r>
+        <w:t xml:space="preserve">Une déclaration validée ou rejetée peut ensuite être archivée ; elle reste consultable par les personnes habilitées.</w:t>
+      </w:r>
+    </w:p>
+    <w:p>
+      <w:pPr>
+        <w:pStyle w:val="Heading3"/>
+        <w:spacing w:after="100" w:before="200"/>
+      </w:pPr>
+      <w:r>
+        <w:rPr>
+          <w:b/>
+          <w:bCs/>
+          <w:color w:val="F79646"/>
+          <w:sz w:val="22"/>
+          <w:szCs w:val="22"/>
+        </w:rPr>
+        <w:t xml:space="preserve">1.5 Communication administrative (Notes de service)</w:t>
+      </w:r>
+    </w:p>
+    <w:p>
+      <w:pPr>
+        <w:pStyle w:val="ListParagraph"/>
+        <w:numPr>
+          <w:ilvl w:val="0"/>
+          <w:numId w:val="2"/>
+        </w:numPr>
+        <w:spacing w:after="100" w:line="290"/>
+        <w:jc w:val="both"/>
+      </w:pPr>
+      <w:r>
+        <w:rPr>
+          <w:b/>
+          <w:bCs/>
+        </w:rPr>
+        <w:t xml:space="preserve">RG20 : </w:t>
+      </w:r>
+      <w:r>
+        <w:t xml:space="preserve">Une note de service est émise par une autorité habilitée (DRH, Directeur de Cabinet, Directeur ou Sous-Directeur) et diffusée vers une ou plusieurs structures destinataires.</w:t>
+      </w:r>
+    </w:p>
+    <w:p>
+      <w:pPr>
+        <w:pStyle w:val="ListParagraph"/>
+        <w:numPr>
+          <w:ilvl w:val="0"/>
+          <w:numId w:val="2"/>
+        </w:numPr>
+        <w:spacing w:after="100" w:line="290"/>
+        <w:jc w:val="both"/>
+      </w:pPr>
+      <w:r>
+        <w:rPr>
+          <w:b/>
+          <w:bCs/>
+        </w:rPr>
+        <w:t xml:space="preserve">RG21 : </w:t>
+      </w:r>
+      <w:r>
+        <w:t xml:space="preserve">Une structure peut être destinataire de zéro à plusieurs notes de service.</w:t>
+      </w:r>
+    </w:p>
+    <w:p>
+      <w:pPr>
+        <w:pStyle w:val="ListParagraph"/>
+        <w:numPr>
+          <w:ilvl w:val="0"/>
+          <w:numId w:val="2"/>
+        </w:numPr>
+        <w:spacing w:after="100" w:line="290"/>
+        <w:jc w:val="both"/>
+      </w:pPr>
+      <w:r>
+        <w:rPr>
+          <w:b/>
+          <w:bCs/>
+        </w:rPr>
+        <w:t xml:space="preserve">RG22 : </w:t>
+      </w:r>
+      <w:r>
+        <w:t xml:space="preserve">La diffusion d'une note de service à ses destinataires donne lieu à une notification dans la plateforme et à l'envoi d'un email.</w:t>
+      </w:r>
+    </w:p>
+    <w:p>
+      <w:pPr>
+        <w:pStyle w:val="Heading3"/>
+        <w:spacing w:after="100" w:before="200"/>
+      </w:pPr>
+      <w:r>
+        <w:rPr>
+          <w:b/>
+          <w:bCs/>
+          <w:color w:val="F79646"/>
+          <w:sz w:val="22"/>
+          <w:szCs w:val="22"/>
+        </w:rPr>
+        <w:t xml:space="preserve">1.6 Documents et justificatifs</w:t>
+      </w:r>
+    </w:p>
+    <w:p>
+      <w:pPr>
+        <w:pStyle w:val="ListParagraph"/>
+        <w:numPr>
+          <w:ilvl w:val="0"/>
+          <w:numId w:val="2"/>
+        </w:numPr>
+        <w:spacing w:after="100" w:line="290"/>
+        <w:jc w:val="both"/>
+      </w:pPr>
+      <w:r>
+        <w:rPr>
+          <w:b/>
+          <w:bCs/>
+        </w:rPr>
+        <w:t xml:space="preserve">RG23 : </w:t>
+      </w:r>
+      <w:r>
+        <w:t xml:space="preserve">Une pièce jointe est rattachée à un seul dossier : une demande de permission, une déclaration de naissance, une déclaration de décès ou une note de service.</w:t>
+      </w:r>
+    </w:p>
+    <w:p>
+      <w:pPr>
+        <w:pStyle w:val="ListParagraph"/>
+        <w:numPr>
+          <w:ilvl w:val="0"/>
+          <w:numId w:val="2"/>
+        </w:numPr>
+        <w:spacing w:after="100" w:line="290"/>
+        <w:jc w:val="both"/>
+      </w:pPr>
+      <w:r>
+        <w:rPr>
+          <w:b/>
+          <w:bCs/>
+        </w:rPr>
+        <w:t xml:space="preserve">RG24 : </w:t>
+      </w:r>
+      <w:r>
+        <w:t xml:space="preserve">Une pièce jointe n'est consultable que par les personnes habilitées, selon la nature du dossier auquel elle est rattachée.</w:t>
       </w:r>
     </w:p>
     <w:sectPr>

</xml_diff>